<commit_message>
9 Oct: remove Jhang constables from Issues (covered in health totals)
Co-Authored-By: Claude Sonnet 5.5 <noreply@anthropic.com>
Claude-Session: https://claude.ai/code/session_01Y3V5mhbu8nznWPRDFjfQZx
</commit_message>
<xml_diff>
--- a/IGP_Brief_09-10-2026.docx
+++ b/IGP_Brief_09-10-2026.docx
@@ -290,99 +290,6 @@
           <w:szCs w:val="24"/>
         </w:rPr>
         <w:t xml:space="preserve"> points; rest resolved.</w:t>
-      </w:r>
-    </w:p>
-    <w:p>
-      <w:pPr>
-        <w:pStyle w:val="ListParagraph"/>
-        <w:numPr>
-          <w:ilvl w:val="0"/>
-          <w:numId w:val="19"/>
-        </w:numPr>
-        <w:spacing w:after="40" w:line="360" w:lineRule="auto"/>
-        <w:jc w:val="both"/>
-        <w:rPr>
-          <w:sz w:val="28"/>
-          <w:szCs w:val="24"/>
-        </w:rPr>
-      </w:pPr>
-      <w:r>
-        <w:rPr>
-          <w:b/>
-          <w:sz w:val="28"/>
-          <w:szCs w:val="24"/>
-        </w:rPr>
-        <w:t xml:space="preserve">Issue - Jhang constables (heart):</w:t>
-      </w:r>
-      <w:r>
-        <w:rPr>
-          <w:b w:val="0"/>
-          <w:sz w:val="28"/>
-          <w:szCs w:val="24"/>
-        </w:rPr>
-        <w:t xml:space="preserve"> DPO Jhang reported that Const. Mumtaz Hussain 2327/C and Const. Muhammad Asif 1525/C (Jhang) suffered minor heart attacks.</w:t>
-      </w:r>
-    </w:p>
-    <w:p>
-      <w:pPr>
-        <w:pStyle w:val="ListParagraph"/>
-        <w:numPr>
-          <w:ilvl w:val="0"/>
-          <w:numId w:val="19"/>
-        </w:numPr>
-        <w:spacing w:after="40" w:line="360" w:lineRule="auto"/>
-        <w:jc w:val="both"/>
-        <w:rPr>
-          <w:sz w:val="28"/>
-          <w:szCs w:val="24"/>
-        </w:rPr>
-      </w:pPr>
-      <w:r>
-        <w:rPr>
-          <w:b/>
-          <w:sz w:val="28"/>
-          <w:szCs w:val="24"/>
-        </w:rPr>
-        <w:t xml:space="preserve">Action / Solution Taken:</w:t>
-      </w:r>
-      <w:r>
-        <w:rPr>
-          <w:b w:val="0"/>
-          <w:sz w:val="28"/>
-          <w:szCs w:val="24"/>
-        </w:rPr>
-        <w:t xml:space="preserve"> Mumtaz Hussain was admitted at THQ Jand and referred to a Rawalpindi hospital, where he is still under observation. Muhammad Asif was medically examined (cardiac issue) and is under checkup and treatment (3 days medical rest).</w:t>
-      </w:r>
-    </w:p>
-    <w:p>
-      <w:pPr>
-        <w:pStyle w:val="ListParagraph"/>
-        <w:numPr>
-          <w:ilvl w:val="0"/>
-          <w:numId w:val="19"/>
-        </w:numPr>
-        <w:spacing w:after="40" w:line="360" w:lineRule="auto"/>
-        <w:jc w:val="both"/>
-        <w:rPr>
-          <w:sz w:val="28"/>
-          <w:szCs w:val="24"/>
-        </w:rPr>
-      </w:pPr>
-      <w:r>
-        <w:rPr>
-          <w:b/>
-          <w:sz w:val="28"/>
-          <w:szCs w:val="24"/>
-        </w:rPr>
-        <w:t xml:space="preserve">Current Position:</w:t>
-      </w:r>
-      <w:r>
-        <w:rPr>
-          <w:b w:val="0"/>
-          <w:sz w:val="28"/>
-          <w:szCs w:val="24"/>
-        </w:rPr>
-        <w:t xml:space="preserve"> Both under medical observation/treatment; nothing else pending.</w:t>
       </w:r>
     </w:p>
     <w:p>

</xml_diff>